<commit_message>
Auto sync: Dữ liệu AI Điểm Tin mới
</commit_message>
<xml_diff>
--- a/Daily Reports/02_09_2026-CBOT Reports.docx
+++ b/Daily Reports/02_09_2026-CBOT Reports.docx
@@ -104,7 +104,7 @@
           <w:color w:val="5C768D"/>
           <w:sz w:val="19"/>
         </w:rPr>
-        <w:t>Cập nhật tự động qua `macro_tracker.py` vào lúc 06:01 ICT ngày 02/09/2026</w:t>
+        <w:t>Cập nhật tự động qua `macro_tracker.py` vào lúc 06:32 ICT ngày 02/09/2026</w:t>
       </w:r>
     </w:p>
     <w:tbl>
@@ -313,7 +313,7 @@
               <w:rPr>
                 <w:b/>
               </w:rPr>
-              <w:t>95.23 / thùng</w:t>
+              <w:t>95.26 / thùng</w:t>
             </w:r>
           </w:p>
         </w:tc>
@@ -344,7 +344,7 @@
               <w:rPr>
                 <w:b/>
               </w:rPr>
-              <w:t>+5.24%</w:t>
+              <w:t>+5.27%</w:t>
             </w:r>
           </w:p>
         </w:tc>
@@ -1228,7 +1228,7 @@
         <w:rPr>
           <w:b/>
         </w:rPr>
-        <w:t>`95.23` (+5.24%)</w:t>
+        <w:t>`95.26` (+5.27%)</w:t>
       </w:r>
       <w:r>
         <w:t xml:space="preserve"> | DXY: </w:t>
@@ -1316,7 +1316,7 @@
           <w:color w:val="5C768D"/>
           <w:sz w:val="19"/>
         </w:rPr>
-        <w:t>Cập nhật tự động lúc 06:01 ICT ngày 02/09/2026 — Nguồn: NOAA, USDA, BOM Australia</w:t>
+        <w:t>Cập nhật tự động lúc 06:32 ICT ngày 02/09/2026 — Nguồn: NOAA, USDA, BOM Australia</w:t>
       </w:r>
     </w:p>
     <w:p>
@@ -11991,7 +11991,7 @@
               <w:rPr>
                 <w:b/>
               </w:rPr>
-              <w:t>95.23</w:t>
+              <w:t>95.26</w:t>
             </w:r>
           </w:p>
         </w:tc>
@@ -12022,7 +12022,7 @@
               <w:rPr>
                 <w:b/>
               </w:rPr>
-              <w:t>+5.24%</w:t>
+              <w:t>+5.27%</w:t>
             </w:r>
           </w:p>
         </w:tc>
@@ -22172,7 +22172,7 @@
               <w:rPr>
                 <w:b/>
               </w:rPr>
-              <w:t>95.23</w:t>
+              <w:t>95.26</w:t>
             </w:r>
           </w:p>
         </w:tc>
@@ -22203,7 +22203,7 @@
               <w:rPr>
                 <w:b/>
               </w:rPr>
-              <w:t>+5.24%</w:t>
+              <w:t>+5.27%</w:t>
             </w:r>
           </w:p>
         </w:tc>

</xml_diff>